<commit_message>
Add governed documentation baseline (Architecture, Business, Security, Sales, Integrations, Compliance, ADRs, AI_CONTEXT, design references)
The full SA-ARCH/SA-BIZ/SA-SEC/SA-SAL/SA-INT/SA-COM documentation
taxonomy, Architecture Baseline v1.0 (SA-ARCH-000/001/011/012/013/999,
SA-TRACE-001, SA-AUDIT-002, SA-ROADMAP-001), ADR-001-005 relabeled
Accepted->Locked per SA-ARCH-999, ADR-006-008, the new ADR-009
(Account/Tenant/Family/Entitlement, Approved v1.1), the SA-ARCH-014
Account/Family/Entitlement package (Wave A/B/C0/C1), the SA-AUTH-001
and SA-AUTH-002 frozen specifications, SA-UX-009 Main UI Foundation
spec, and the visual-design AI_CONTEXT/design reference material
(Weave foundation, HSA-06/07/08 review records, visual reference
evaluations). None of this was previously committed.

Co-Authored-By: Claude Sonnet 5 <noreply@anthropic.com>
</commit_message>
<xml_diff>
--- a/documentation/SA-ARCH-006_Integration_Standalone_Reminders.docx
+++ b/documentation/SA-ARCH-006_Integration_Standalone_Reminders.docx
@@ -221,7 +221,7 @@
                 <w:szCs w:val="20"/>
                 <w:rtl/>
               </w:rPr>
-              <w:t xml:space="preserve">SAC-ARCH-000 v2.1.0 — البنية المعمارية التأسيسية</w:t>
+              <w:t xml:space="preserve">SA-ARCH-000 v1.0 — البنية المعمارية التأسيسية</w:t>
             </w:r>
           </w:p>
         </w:tc>
@@ -496,7 +496,7 @@
                 <w:szCs w:val="20"/>
                 <w:rtl/>
               </w:rPr>
-              <w:t xml:space="preserve">SAC-ARCH-000 v2.1.0، Universal Connector Engine، Layer 1D، طبقة ACE</w:t>
+              <w:t xml:space="preserve">SA-ARCH-000 v1.0، Universal Connector Engine، Layer 1D، طبقة ACE</w:t>
             </w:r>
           </w:p>
         </w:tc>
@@ -542,7 +542,7 @@
           <w:szCs w:val="22"/>
           <w:rtl/>
         </w:rPr>
-        <w:t xml:space="preserve">هذه الوثيقة توثّق رسميًا مبدأين كانا مضمّنين ضمنيًا في البنية المعمارية التأسيسية SAC-ARCH-000 v2.1.0، وتجعلهما صريحين وقابلين للرجوع إليهما دون اجتهاد أو تخمين في أي جلسة عمل لاحقة: (١) وجوب عمل SmartArchive بشكل متكامل مع أنظمة الإدارة الموجودة لدى الشركات والمعامل والمستودعات والجهات الحكومية (ERP، CRM، وما شابه)، مع توفر وضع مستقل مبسّط عند غياب أي نظام من هذا القبيل، و(٢) وجود ميزة تذكيرات عامة بالمواعيد كطبقة خدمة موحدة عبر المنتج. هذا الملحق لا يُغيّر البنية المعمارية القائمة، بل يوثّقها بشكل صريح.</w:t>
+        <w:t xml:space="preserve">هذه الوثيقة توثّق رسميًا مبدأين كانا مضمّنين ضمنيًا في البنية المعمارية التأسيسية SA-ARCH-000 v1.0، وتجعلهما صريحين وقابلين للرجوع إليهما دون اجتهاد أو تخمين في أي جلسة عمل لاحقة: (١) وجوب عمل SmartArchive بشكل متكامل مع أنظمة الإدارة الموجودة لدى الشركات والمعامل والمستودعات والجهات الحكومية (ERP، CRM، وما شابه)، مع توفر وضع مستقل مبسّط عند غياب أي نظام من هذا القبيل، و(٢) وجود ميزة تذكيرات عامة بالمواعيد كطبقة خدمة موحدة عبر المنتج. هذا الملحق لا يُغيّر البنية المعمارية القائمة، بل يوثّقها بشكل صريح.</w:t>
       </w:r>
     </w:p>
     <w:p>
@@ -816,7 +816,7 @@
           <w:szCs w:val="22"/>
           <w:rtl/>
         </w:rPr>
-        <w:t xml:space="preserve">الوضع المتكامل (Integrated Mode) هو السلوك الافتراضي في كل هذه الحالات، وهو ما تم إقراره أصلًا ضمن SAC-ARCH-000. لا يُنشئ SmartArchive أي وظيفة CRM أو ERP بديلة أو منافسة؛ بل يضيف طبقة ذكاء مستندي فوق الأنظمة القائمة.</w:t>
+        <w:t xml:space="preserve">الوضع المتكامل (Integrated Mode) هو السلوك الافتراضي في كل هذه الحالات، وهو ما تم إقراره أصلًا ضمن SA-ARCH-000. لا يُنشئ SmartArchive أي وظيفة CRM أو ERP بديلة أو منافسة؛ بل يضيف طبقة ذكاء مستندي فوق الأنظمة القائمة.</w:t>
       </w:r>
     </w:p>
     <w:p>
@@ -1027,7 +1027,7 @@
           <w:szCs w:val="22"/>
           <w:rtl/>
         </w:rPr>
-        <w:t xml:space="preserve">لا يوجد أي تغيير في البنية المعمارية لـ SAC-ARCH-000 v2.1.0. هذه الوثيقة توثيقية بحتة، هدفها منع الاجتهاد أو إعادة التفسير في الجلسات اللاحقة. أي تطوير مستقبلي يتعلق بموصلات جديدة (Connectors) لقطاعات محددة (معامل، مستودعات، جهات حكومية) يجب أن يُوثّق كتحديث فرعي ضمن Universal Connector Engine، لا كوثيقة منفصلة.</w:t>
+        <w:t xml:space="preserve">لا يوجد أي تغيير في البنية المعمارية لـ SA-ARCH-000 v1.0. هذه الوثيقة توثيقية بحتة، هدفها منع الاجتهاد أو إعادة التفسير في الجلسات اللاحقة. أي تطوير مستقبلي يتعلق بموصلات جديدة (Connectors) لقطاعات محددة (معامل، مستودعات، جهات حكومية) يجب أن يُوثّق كتحديث فرعي ضمن Universal Connector Engine، لا كوثيقة منفصلة.</w:t>
       </w:r>
     </w:p>
     <w:p>

</xml_diff>